<commit_message>
Expand marketing resume's Professional Profile with trends/gaps-to-solutions narrative
Ties the marketing background directly to how the developer role came about,
and regenerates the matching DOCX exports.
</commit_message>
<xml_diff>
--- a/public/Sam_Lappan_Resume.docx
+++ b/public/Sam_Lappan_Resume.docx
@@ -142,7 +142,7 @@
             <w:pPr>
               <w:spacing w:after="40"/>
             </w:pPr>
-            <w:hyperlink w:history="1" r:id="rId7f5vkl3knhdrkwwhdkpif">
+            <w:hyperlink w:history="1" r:id="rIdulaj0aailbmo4yuwvpysb">
               <w:r>
                 <w:rPr>
                   <w:rFonts w:ascii="Arial" w:cs="Arial" w:eastAsia="Arial" w:hAnsi="Arial"/>
@@ -159,7 +159,7 @@
             <w:pPr>
               <w:spacing w:after="40"/>
             </w:pPr>
-            <w:hyperlink w:history="1" r:id="rIdtybbrbdjcetmjcuoigujz">
+            <w:hyperlink w:history="1" r:id="rIdy8c9u-qishmceelbcijag">
               <w:r>
                 <w:rPr>
                   <w:rFonts w:ascii="Arial" w:cs="Arial" w:eastAsia="Arial" w:hAnsi="Arial"/>
@@ -176,7 +176,7 @@
             <w:pPr>
               <w:spacing w:after="40"/>
             </w:pPr>
-            <w:hyperlink w:history="1" r:id="rIdms4t4-a8_h-sigecoek9j">
+            <w:hyperlink w:history="1" r:id="rIdsstnao5fc1h5d_hqxmrqk">
               <w:r>
                 <w:rPr>
                   <w:rFonts w:ascii="Arial" w:cs="Arial" w:eastAsia="Arial" w:hAnsi="Arial"/>

</xml_diff>

<commit_message>
Rewrite marketing resume's Professional Profile in a tighter, less conversational resume voice
Names the full Business, Innovation & Entrepreneurship degree, states who/where/how,
and leads with adaptability as the core value proposition.
</commit_message>
<xml_diff>
--- a/public/Sam_Lappan_Resume.docx
+++ b/public/Sam_Lappan_Resume.docx
@@ -142,7 +142,7 @@
             <w:pPr>
               <w:spacing w:after="40"/>
             </w:pPr>
-            <w:hyperlink w:history="1" r:id="rIdulaj0aailbmo4yuwvpysb">
+            <w:hyperlink w:history="1" r:id="rIdv9h06utabbylcbfo6r77k">
               <w:r>
                 <w:rPr>
                   <w:rFonts w:ascii="Arial" w:cs="Arial" w:eastAsia="Arial" w:hAnsi="Arial"/>
@@ -159,7 +159,7 @@
             <w:pPr>
               <w:spacing w:after="40"/>
             </w:pPr>
-            <w:hyperlink w:history="1" r:id="rIdy8c9u-qishmceelbcijag">
+            <w:hyperlink w:history="1" r:id="rIdzc1wim_rc8z7oeteel-9o">
               <w:r>
                 <w:rPr>
                   <w:rFonts w:ascii="Arial" w:cs="Arial" w:eastAsia="Arial" w:hAnsi="Arial"/>
@@ -176,7 +176,7 @@
             <w:pPr>
               <w:spacing w:after="40"/>
             </w:pPr>
-            <w:hyperlink w:history="1" r:id="rIdsstnao5fc1h5d_hqxmrqk">
+            <w:hyperlink w:history="1" r:id="rId_x222gdbwit1dapmf5zjh">
               <w:r>
                 <w:rPr>
                   <w:rFonts w:ascii="Arial" w:cs="Arial" w:eastAsia="Arial" w:hAnsi="Arial"/>

</xml_diff>

<commit_message>
Add customer data language to marketing resume's Data & Analytics skill line
Accurately reflects the customer/retailer data work already done, phrased to
match the language used in CRM/martech-style role postings.
</commit_message>
<xml_diff>
--- a/public/Sam_Lappan_Resume.docx
+++ b/public/Sam_Lappan_Resume.docx
@@ -142,7 +142,7 @@
             <w:pPr>
               <w:spacing w:after="40"/>
             </w:pPr>
-            <w:hyperlink w:history="1" r:id="rIdv9h06utabbylcbfo6r77k">
+            <w:hyperlink w:history="1" r:id="rIdcrnup_twp26ro0-umzwyt">
               <w:r>
                 <w:rPr>
                   <w:rFonts w:ascii="Arial" w:cs="Arial" w:eastAsia="Arial" w:hAnsi="Arial"/>
@@ -159,7 +159,7 @@
             <w:pPr>
               <w:spacing w:after="40"/>
             </w:pPr>
-            <w:hyperlink w:history="1" r:id="rIdzc1wim_rc8z7oeteel-9o">
+            <w:hyperlink w:history="1" r:id="rIda-ieuace6dmijqbbv14aq">
               <w:r>
                 <w:rPr>
                   <w:rFonts w:ascii="Arial" w:cs="Arial" w:eastAsia="Arial" w:hAnsi="Arial"/>
@@ -176,7 +176,7 @@
             <w:pPr>
               <w:spacing w:after="40"/>
             </w:pPr>
-            <w:hyperlink w:history="1" r:id="rId_x222gdbwit1dapmf5zjh">
+            <w:hyperlink w:history="1" r:id="rIdnrp8tu5dlssnqfawqrzdy">
               <w:r>
                 <w:rPr>
                   <w:rFonts w:ascii="Arial" w:cs="Arial" w:eastAsia="Arial" w:hAnsi="Arial"/>

</xml_diff>